<commit_message>
book-v2: recompile Word edition with Design 6 germination update in Ch.30
Co-Authored-By: Claude Fable 5 <noreply@anthropic.com>
Claude-Session: https://claude.ai/code/session_018EaZKVnM7qgMnuetybpxVh
</commit_message>
<xml_diff>
--- a/book-v2/COHERENCE-GeometryOfEverything-1618G03-R2.docx
+++ b/book-v2/COHERENCE-GeometryOfEverything-1618G03-R2.docx
@@ -4836,7 +4836,88 @@
         <w:t xml:space="preserve">Paired-HRV synchrony</w:t>
       </w:r>
       <w:r>
-        <w:t xml:space="preserve"> during shared 0.1 Hz practice (from Part VII) — cheap, humane, and photogenic. (v1's fifth design, the still-point fluctuation detector in nonlinear optics, remains on the long list at $20–40K, behind the five above on evidence-per-dollar.)</w:t>
+        <w:t xml:space="preserve"> during shared 0.1 Hz practice (from Part VII) — cheap, humane, and photogenic. (v1's fifth design, the still-point fluctuation detector in nonlinear optics, remains on the long list at $20–40K, behind the others on evidence-per-dollar.)</w:t>
+      </w:r>
+    </w:p>
+    <w:p>
+      <w:pPr>
+        <w:pStyle w:val="ListParagraph"/>
+        <w:numPr>
+          <w:ilvl w:val="0"/>
+          <w:numId w:val="4"/>
+        </w:numPr>
+        <w:spacing w:after="80"/>
+      </w:pPr>
+      <w:r>
+        <w:rPr>
+          <w:b/>
+          <w:bCs/>
+        </w:rPr>
+        <w:t xml:space="preserve">Seed germination — the framework's cleanest falsification target.</w:t>
+      </w:r>
+      <w:r>
+        <w:t xml:space="preserve"> A pre-registered φ vs. matched-non-φ vs. plastic-number-ρ vs. sham trial on one homogeneous seed lot: germination fraction, T50, and seedling vigor, with tray positions randomized and scoring blinded. Its singular virtue: </w:t>
+      </w:r>
+      <w:r>
+        <w:rPr>
+          <w:i/>
+          <w:iCs/>
+        </w:rPr>
+        <w:t xml:space="preserve">a seed has no placebo</w:t>
+      </w:r>
+      <w:r>
+        <w:t xml:space="preserve"> — it expects nothing, cannot relax or hope, and so removes the one confound that haunts every human-facing test above. The framework </w:t>
+      </w:r>
+      <w:r>
+        <w:rPr>
+          <w:i/>
+          <w:iCs/>
+        </w:rPr>
+        <w:t xml:space="preserve">predicts</w:t>
+      </w:r>
+      <w:r>
+        <w:t xml:space="preserve"> the effect [I motivation]: it reads a seed as a φ-nested standing wave and germination as Chapter 6's nucleation, so a coherent low-noise field should lower the threshold to sprout. A partly-mainstream neighbor makes a germination effect plausible in general — cold atmospheric plasma seed priming is a real, published (if dose- and species-dependent) agricultural result — but honesty requires the mechanism gap: that evidence comes from </w:t>
+      </w:r>
+      <w:r>
+        <w:rPr>
+          <w:i/>
+          <w:iCs/>
+        </w:rPr>
+        <w:t xml:space="preserve">direct plasma contact</w:t>
+      </w:r>
+      <w:r>
+        <w:t xml:space="preserve"> (reactive-species chemistry), whereas Thera-phi delivers a </w:t>
+      </w:r>
+      <w:r>
+        <w:rPr>
+          <w:i/>
+          <w:iCs/>
+        </w:rPr>
+        <w:t xml:space="preserve">distal field</w:t>
+      </w:r>
+      <w:r>
+        <w:t xml:space="preserve">, a different and unvalidated channel; the shared word "plasma" transfers no evidence. So the </w:t>
+      </w:r>
+      <w:r>
+        <w:rPr>
+          <w:i/>
+          <w:iCs/>
+        </w:rPr>
+        <w:t xml:space="preserve">distinctive</w:t>
+      </w:r>
+      <w:r>
+        <w:t xml:space="preserve"> test is the φ-vs-ρ-vs-non-φ contrast, not "does a field help" (partly known already). Cheapest high-powered study in the book; full protocol in </w:t>
+      </w:r>
+      <w:r>
+        <w:rPr>
+          <w:rFonts w:ascii="Courier New" w:cs="Courier New" w:eastAsia="Courier New" w:hAnsi="Courier New"/>
+          <w:sz w:val="20"/>
+          <w:szCs w:val="20"/>
+        </w:rPr>
+        <w:t xml:space="preserve">re-work-axiom-07162026/EXPERIMENTS.md</w:t>
+      </w:r>
+      <w:r>
+        <w:t xml:space="preserve">, Design 6. (This is also the honest home for Dan Winter's sacred-site seed claim: his on-site demonstrations are motivating testimony, not confirmation, and the design here is what would turn one into the other.)</w:t>
       </w:r>
     </w:p>
     <w:p>

</xml_diff>